<commit_message>
docs: improve deployment submission readability
</commit_message>
<xml_diff>
--- a/academic/submissions/07_Deployment_Submission.docx
+++ b/academic/submissions/07_Deployment_Submission.docx
@@ -46,7 +46,7 @@
           <w:color w:val="000000"/>
           <w:sz w:val="27"/>
         </w:rPr>
-        <w:t>GrowthPilot AI Açıklanabilir Müşteri Hareketsizliği Modelinin Güvenli ve İzlenebilir Sunum Mimarisi</w:t>
+        <w:t>GrowthPilot AI Müşteri Hareketsizliği Modelinin Güvenli ve İzlenebilir Sunumu</w:t>
       </w:r>
     </w:p>
     <w:p>
@@ -231,7 +231,7 @@
           <w:rFonts w:ascii="Times New Roman" w:hAnsi="Times New Roman"/>
           <w:color w:val="000000"/>
         </w:rPr>
-        <w:t>GrowthPilot AI, müşteri ve sipariş geçmişinden gelecekteki satın alma hareketsizliği olasılığını hesaplayan modeli CRM akışına bağlar. Bu rapor; model serileştirme (model serialization), çalışma anında yükleme, API ile çıkarım, güvenlik ve izleme sınırlarını inceler. Çıkarım kodu, API, kalıcı tahmin kayıtları, iş kuyruğu, güvenlik kontrolleri, container tanımı ve AWS Terraform referansı proje deposunda bulunur ve yerel testlerle doğrulanır. Canlı bulut dağıtımı, üretim kimlik sağlayıcısı, yönetilen alarm sistemi ve gerçek müşteri verisiyle model doğrulaması ise henüz yapılmamıştır.</w:t>
+        <w:t>GrowthPilot AI, müşteri ve sipariş geçmişinden gelecekteki satın alma hareketsizliği olasılığını hesaplayan modeli CRM akışına bağlar. Bu rapor modelin kaydedilmesini, çalışma anında yüklenmesini, API üzerinden tahmin üretmesini, güvenliğini ve izlenmesini inceler. Çıkarım kodu, kalıcı tahmin kayıtları, iş kuyruğu ve güvenlik kontrolleri proje deposunda bulunur; yerel testlerden geçmiştir. Konteyner tanımı ve AWS Terraform kodu da depodadır. Ancak canlı bulut dağıtımı, üretim kimlik sağlayıcısı, yönetilen alarmlar ve gerçek müşteri verisiyle model doğrulaması henüz yapılmamıştır.</w:t>
       </w:r>
     </w:p>
     <w:p>
@@ -367,7 +367,7 @@
                 <w:color w:val="FFFFFF"/>
                 <w:sz w:val="16"/>
               </w:rPr>
-              <w:t>Repository kanıtı</w:t>
+              <w:t>Depodaki kanıt</w:t>
             </w:r>
           </w:p>
         </w:tc>
@@ -2894,7 +2894,7 @@
         <w:rPr>
           <w:rFonts w:ascii="Menlo" w:hAnsi="Menlo"/>
           <w:color w:val="173B52"/>
-          <w:sz w:val="14"/>
+          <w:sz w:val="16"/>
         </w:rPr>
         <w:t>class LocalCandidatePredictor:</w:t>
         <w:br/>
@@ -3083,7 +3083,7 @@
           <w:rFonts w:ascii="Times New Roman" w:hAnsi="Times New Roman"/>
           <w:color w:val="000000"/>
         </w:rPr>
-        <w:t xml:space="preserve">Arka uç container oluşturma sözleşmesi, onaylı model dosyasının oluşturma sırasında BuildKit secret olarak </w:t>
+        <w:t xml:space="preserve">Arka uç Dockerfile'ı, onaylı model dosyasının BuildKit </w:t>
       </w:r>
       <w:r>
         <w:rPr>
@@ -3098,7 +3098,7 @@
           <w:rFonts w:ascii="Times New Roman" w:hAnsi="Times New Roman"/>
           <w:color w:val="000000"/>
         </w:rPr>
-        <w:t xml:space="preserve"> kimliğiyle sağlanmasını gerektirir. </w:t>
+        <w:t xml:space="preserve"> gizli girdisiyle sağlanmasını zorunlu kılar. </w:t>
       </w:r>
       <w:r>
         <w:rPr>
@@ -3113,7 +3113,7 @@
           <w:rFonts w:ascii="Times New Roman" w:hAnsi="Times New Roman"/>
           <w:color w:val="000000"/>
         </w:rPr>
-        <w:t xml:space="preserve">, dosyayı nesneye dönüştürmeden SHA-256 değerini doğrular. Eksik veya uyumsuz dosya container oluşturmayı durdurur. Doğrulanan dosya salt okunur olarak </w:t>
+        <w:t xml:space="preserve"> dosyayı yüklemeden önce SHA-256 değerini manifestle karşılaştırır; eksik veya uyumsuz dosya imaj oluşturmayı durdurur. Doğrulanan dosya </w:t>
       </w:r>
       <w:r>
         <w:rPr>
@@ -3128,7 +3128,7 @@
           <w:rFonts w:ascii="Times New Roman" w:hAnsi="Times New Roman"/>
           <w:color w:val="000000"/>
         </w:rPr>
-        <w:t xml:space="preserve"> yoluna kurulur. Dockerfile'daki </w:t>
+        <w:t xml:space="preserve"> konumuna salt okunur kurulur. </w:t>
       </w:r>
       <w:r>
         <w:rPr>
@@ -3143,7 +3143,7 @@
           <w:rFonts w:ascii="Times New Roman" w:hAnsi="Times New Roman"/>
           <w:color w:val="000000"/>
         </w:rPr>
-        <w:t xml:space="preserve"> bu yolu, </w:t>
+        <w:t xml:space="preserve"> bu dosyayı, </w:t>
       </w:r>
       <w:r>
         <w:rPr>
@@ -3173,22 +3173,7 @@
           <w:rFonts w:ascii="Times New Roman" w:hAnsi="Times New Roman"/>
           <w:color w:val="000000"/>
         </w:rPr>
-        <w:t xml:space="preserve"> yolunu gösterir; bunlar </w:t>
-      </w:r>
-      <w:r>
-        <w:rPr>
-          <w:rFonts w:ascii="Menlo" w:hAnsi="Menlo"/>
-          <w:color w:val="173B52"/>
-          <w:sz w:val="18"/>
-        </w:rPr>
-        <w:t>Settings</w:t>
-      </w:r>
-      <w:r>
-        <w:rPr>
-          <w:rFonts w:ascii="Times New Roman" w:hAnsi="Times New Roman"/>
-          <w:color w:val="000000"/>
-        </w:rPr>
-        <w:t xml:space="preserve"> alan adlarıyla eşleşir. Uygulama yükleme sırasında SHA-256 kontrolünü tekrarlar ve uyumsuzlukta başlatmayı reddeder. Bu davranış kod ve test düzeyinde bir sözleşmedir; bu ortamda gerçek container oluşturulmamıştır. Özel model deposu, imzalı terfi süreci, sürüm yayınlama işlem hattı ve container kayıt deposu henüz uygulanmamıştır.</w:t>
+        <w:t xml:space="preserve"> manifestini gösterir. Uygulama yükleme öncesinde hash'i yeniden denetler. Bunlar kod ve test düzeyinde doğrulanmıştır; Docker motoru bulunmadığından gerçek imaj oluşturulmamıştır. Özel model deposu, imzalı terfi ve imaj yayımlama süreci de henüz uygulanmamıştır.</w:t>
       </w:r>
     </w:p>
     <w:p>
@@ -3323,7 +3308,8 @@
     </w:p>
     <w:p>
       <w:pPr>
-        <w:spacing w:before="100" w:after="60"/>
+        <w:keepNext/>
+        <w:spacing w:before="40" w:after="60"/>
         <w:jc w:val="center"/>
       </w:pPr>
       <w:r>
@@ -3363,7 +3349,7 @@
     </w:p>
     <w:p>
       <w:pPr>
-        <w:spacing w:after="140"/>
+        <w:spacing w:after="100"/>
         <w:jc w:val="center"/>
       </w:pPr>
       <w:r>
@@ -3737,7 +3723,7 @@
           <w:rFonts w:ascii="Times New Roman" w:hAnsi="Times New Roman"/>
           <w:color w:val="000000"/>
         </w:rPr>
-        <w:t>Platform seçimi iki ayrı ihtiyeti karşılar. Yerel PostgreSQL, Redis ve model dosyası geliştirme ile tekrar üretilebilir testler için ücretli bulut bağımlılığı oluşturmadan çalışır. AWS referansı ise container iş yükü, yönetilen veri servisleri, özel ağ ve şifreleme ihtiyaçlarını kodla ifade eder. Repository’de on-premises production topolojisi veya sağlayıcılar arası maliyet ve gecikme karşılaştırması yoktur; bu nedenle AWS tasarımı ölçülmüş üstünlük sonucu değil, kabul edilmiş operasyon ADR’sinin denetlenebilir referansıdır.</w:t>
+        <w:t>Yerel PostgreSQL, Redis ve model dosyası, geliştirme ve tekrarlanabilir testler için ücretli bulut hizmeti gerektirmez. AWS referansı ise konteyner iş yükünü, yönetilen veri servislerini, özel ağı ve şifrelemeyi kodla tanımlar. Depoda kurum içi üretim ortamı tasarımı veya bulut sağlayıcıları arasında ölçülmüş maliyet ve gecikme karşılaştırması yoktur. Bu nedenle AWS seçimi kanıtlanmış bir üstünlük iddiası değil, onaylanmış mimari kararın denetlenebilir örneğidir.</w:t>
       </w:r>
     </w:p>
     <w:p>
@@ -3823,7 +3809,16 @@
           <w:rFonts w:ascii="Times New Roman" w:hAnsi="Times New Roman"/>
           <w:color w:val="000000"/>
         </w:rPr>
-        <w:t xml:space="preserve">Modüler monolit yaklaşımı tenant bağlamının model servisine aktarılmasını gereksiz kılar; aynı SQLAlchemy session, RLS, domain kuralları ve audit yordamı çıkarımda kullanılabilir. Özellik üretimi ile operasyonel tablolar aynı sürümde tutulur ve küçük hacimli istek üzerine puanlama için ek ağ sıçraması oluşmaz. Buna karşılık API replikası başına model belleği tüketilir, yalnız model katmanını bağımsız ölçeklemek mümkün değildir ve model değişikliği backend image release’ine bağlanır. Gecikme, throughput, ekip sahipliği veya bağımsız release ihtiyacı büyürse, mevcut </w:t>
+        <w:t>Modüler monolitte tahmin kodu, uygulamanın mevcut organizasyon kapsamını kullanır. Aynı SQLAlchemy oturumu, satır düzeyinde güvenlik kuralları (RLS), alan kuralları ve denetim kayıtları geçerlidir. Özellik üretimi ile iş tabloları aynı sürümde kalır; küçük hacimli tahminlerde ayrı bir servise ağ çağrısı yapılmaz.</w:t>
+      </w:r>
+    </w:p>
+    <w:p>
+      <w:r>
+        <w:rPr>
+          <w:rFonts w:ascii="Times New Roman" w:hAnsi="Times New Roman"/>
+          <w:color w:val="000000"/>
+        </w:rPr>
+        <w:t xml:space="preserve">Bu yapının bedeli, her API kopyasının modeli belleğe yüklemesi ve model katmanının tek başına ölçeklenememesidir. Model değişikliği de yeni arka uç imajı yayımlamayı gerektirir. Gecikme, işlem hacmi veya bağımsız sürüm ihtiyacı artarsa </w:t>
       </w:r>
       <w:r>
         <w:rPr>
@@ -3838,7 +3833,7 @@
           <w:rFonts w:ascii="Times New Roman" w:hAnsi="Times New Roman"/>
           <w:color w:val="000000"/>
         </w:rPr>
-        <w:t xml:space="preserve"> protokolü arkasında ayrı bir servis değerlendirilebilir; tenant kimliği, yetkilendirme ve provenance sözleşmesi korunmadan yapılacak ayrıştırma kabul edilemez.</w:t>
+        <w:t xml:space="preserve"> arayüzü arkasında ayrı bir servis değerlendirilebilir. Böyle bir ayrımda organizasyon kimliği, yetkilendirme ve model soyu korunmalıdır.</w:t>
       </w:r>
     </w:p>
     <w:p>
@@ -4533,7 +4528,7 @@
                 <w:color w:val="000000"/>
                 <w:sz w:val="16"/>
               </w:rPr>
-              <w:t>Process’in HTTP yanıtı verebildiğini gösteren yüzeysel canlılık kontrolü</w:t>
+              <w:t>Uygulama işleminin HTTP yanıtı verebildiğini gösteren yüzeysel canlılık kontrolü</w:t>
             </w:r>
           </w:p>
         </w:tc>
@@ -4907,7 +4902,7 @@
                 <w:color w:val="FFFFFF"/>
                 <w:sz w:val="16"/>
               </w:rPr>
-              <w:t>Endpoint grubu</w:t>
+              <w:t>Uç nokta grubu</w:t>
             </w:r>
           </w:p>
         </w:tc>
@@ -4961,7 +4956,7 @@
                 <w:color w:val="FFFFFF"/>
                 <w:sz w:val="16"/>
               </w:rPr>
-              <w:t>Header girdisi</w:t>
+              <w:t>Başlık girdisi</w:t>
             </w:r>
           </w:p>
         </w:tc>
@@ -5683,7 +5678,7 @@
         <w:rPr>
           <w:rFonts w:ascii="Menlo" w:hAnsi="Menlo"/>
           <w:color w:val="173B52"/>
-          <w:sz w:val="14"/>
+          <w:sz w:val="16"/>
         </w:rPr>
         <w:t>{</w:t>
         <w:br/>
@@ -6378,7 +6373,7 @@
           <w:rFonts w:ascii="Times New Roman" w:hAnsi="Times New Roman"/>
           <w:color w:val="000000"/>
         </w:rPr>
-        <w:t xml:space="preserve">Model dosyası kullanıcı yüklemesinden veya genel bir URL'den alınmaz. Container oluşturma sözleşmesi, dosyanın BuildKit secret olarak sağlanmasını ve SHA-256 değerinin manifestle eşleşmesini zorunlu kılar. Uygulama ilk yüklemede aynı kontrolü yeniden yapar ve ancak sonra </w:t>
+        <w:t xml:space="preserve">Model dosyası kullanıcı yüklemesinden veya genel bir URL'den alınmaz. Konteyner oluşturulurken dosya BuildKit gizli girdisi olarak sağlanmalı ve SHA-256 değeri manifestle eşleşmelidir. Uygulama ilk yüklemede aynı kontrolü yeniden yapar; ancak ardından </w:t>
       </w:r>
       <w:r>
         <w:rPr>
@@ -6393,7 +6388,7 @@
           <w:rFonts w:ascii="Times New Roman" w:hAnsi="Times New Roman"/>
           <w:color w:val="000000"/>
         </w:rPr>
-        <w:t xml:space="preserve"> çağır. SHA-256 bütünlük kanıtıdır; kaynağın yetkili olduğunu tek başına kanıtlamaz. Özel model deposu, imzalı terfi, container kaynağı ve yayın süreci henüz uygulanmamıştır.</w:t>
+        <w:t xml:space="preserve"> çağırır. SHA-256 dosya bütünlüğünü gösterir, kaynağın yetkili olduğunu tek başına kanıtlamaz. Özel model deposu, imzalı terfi ve imaj yayımlama süreci henüz uygulanmamıştır.</w:t>
       </w:r>
     </w:p>
     <w:p>
@@ -6812,13 +6807,14 @@
     </w:p>
     <w:p>
       <w:pPr>
-        <w:spacing w:before="100" w:after="60"/>
+        <w:keepNext/>
+        <w:spacing w:before="40" w:after="60"/>
         <w:jc w:val="center"/>
       </w:pPr>
       <w:r>
         <w:drawing>
           <wp:inline xmlns:a="http://schemas.openxmlformats.org/drawingml/2006/main" xmlns:pic="http://schemas.openxmlformats.org/drawingml/2006/picture">
-            <wp:extent cx="5623560" cy="2882665"/>
+            <wp:extent cx="5212080" cy="2671738"/>
             <wp:docPr id="2" name="Picture 2" title="Şekil 2 İzleme ve üretim doğrulama sınırı" descr="Şekil 2 İzleme ve üretim doğrulama sınırı"/>
             <wp:cNvGraphicFramePr>
               <a:graphicFrameLocks noChangeAspect="1"/>
@@ -6839,7 +6835,7 @@
                   <pic:spPr>
                     <a:xfrm>
                       <a:off x="0" y="0"/>
-                      <a:ext cx="5623560" cy="2882665"/>
+                      <a:ext cx="5212080" cy="2671738"/>
                     </a:xfrm>
                     <a:prstGeom prst="rect"/>
                   </pic:spPr>
@@ -6852,7 +6848,7 @@
     </w:p>
     <w:p>
       <w:pPr>
-        <w:spacing w:after="140"/>
+        <w:spacing w:after="100"/>
         <w:jc w:val="center"/>
       </w:pPr>
       <w:r>
@@ -8216,7 +8212,7 @@
     <w:rPr>
       <w:rFonts w:ascii="Menlo" w:hAnsi="Menlo"/>
       <w:color w:val="173B52"/>
-      <w:sz w:val="14"/>
+      <w:sz w:val="16"/>
     </w:rPr>
   </w:style>
 </w:styles>

</xml_diff>